<commit_message>
runbook: correct Windows detached-launch method + one-agent-at-a-time finding; drop duplicate runbook filename
</commit_message>
<xml_diff>
--- a/docs/Financial-Aid-AgentCore-SA-Runbook.docx
+++ b/docs/Financial-Aid-AgentCore-SA-Runbook.docx
@@ -3981,6 +3981,119 @@
         <w:t xml:space="preserve">aws stepfunctions stop-execution --execution-arn &lt;arn&gt; --region us-east-1   # then redeploy</w:t>
       </w:r>
     </w:p>
+    <w:tbl>
+      <w:tblPr>
+        <w:tblW w:type="pct" w:w="100%"/>
+        <w:tblBorders>
+          <w:top w:val="single" w:color="B9791F" w:sz="2"/>
+          <w:left w:val="single" w:color="B9791F" w:sz="18"/>
+          <w:bottom w:val="single" w:color="B9791F" w:sz="2"/>
+          <w:right w:val="single" w:color="B9791F" w:sz="2"/>
+          <w:insideH w:val="none"/>
+          <w:insideV w:val="none"/>
+        </w:tblBorders>
+      </w:tblPr>
+      <w:tblGrid>
+        <w:gridCol w:w="10440"/>
+      </w:tblGrid>
+      <w:tr>
+        <w:tc>
+          <w:tcPr>
+            <w:tcW w:type="dxa" w:w="10440"/>
+            <w:shd w:fill="FBF3E7" w:val="clear"/>
+            <w:tcMar>
+              <w:top w:type="dxa" w:w="120"/>
+              <w:left w:type="dxa" w:w="180"/>
+              <w:bottom w:type="dxa" w:w="120"/>
+              <w:right w:type="dxa" w:w="180"/>
+            </w:tcMar>
+          </w:tcPr>
+          <w:p>
+            <w:pPr>
+              <w:spacing w:after="40"/>
+            </w:pPr>
+            <w:r>
+              <w:rPr>
+                <w:b/>
+                <w:bCs/>
+                <w:color w:val="B9791F"/>
+                <w:sz w:val="20"/>
+                <w:szCs w:val="20"/>
+              </w:rPr>
+              <w:t xml:space="preserve">One template agent live at a time (per account/region)</w:t>
+            </w:r>
+          </w:p>
+          <w:p>
+            <w:pPr>
+              <w:spacing w:after="20" w:line="258"/>
+            </w:pPr>
+            <w:r>
+              <w:t xml:space="preserve">AgentCore Policy names are unique per account/region, and the template agents share several policy names (</w:t>
+            </w:r>
+            <w:r>
+              <w:rPr>
+                <w:rFonts w:ascii="Consolas" w:cs="Consolas" w:eastAsia="Consolas" w:hAnsi="Consolas"/>
+                <w:color w:val="1B3A2B"/>
+                <w:sz w:val="18"/>
+                <w:szCs w:val="18"/>
+              </w:rPr>
+              <w:t xml:space="preserve">mask_before_assess</w:t>
+            </w:r>
+            <w:r>
+              <w:t xml:space="preserve">, </w:t>
+            </w:r>
+            <w:r>
+              <w:rPr>
+                <w:rFonts w:ascii="Consolas" w:cs="Consolas" w:eastAsia="Consolas" w:hAnsi="Consolas"/>
+                <w:color w:val="1B3A2B"/>
+                <w:sz w:val="18"/>
+                <w:szCs w:val="18"/>
+              </w:rPr>
+              <w:t xml:space="preserve">mask_before_draft</w:t>
+            </w:r>
+            <w:r>
+              <w:t xml:space="preserve">, </w:t>
+            </w:r>
+            <w:r>
+              <w:rPr>
+                <w:rFonts w:ascii="Consolas" w:cs="Consolas" w:eastAsia="Consolas" w:hAnsi="Consolas"/>
+                <w:color w:val="1B3A2B"/>
+                <w:sz w:val="18"/>
+                <w:szCs w:val="18"/>
+              </w:rPr>
+              <w:t xml:space="preserve">no_self_commit</w:t>
+            </w:r>
+            <w:r>
+              <w:t xml:space="preserve">). Deploying a second template agent while another is live fails with </w:t>
+            </w:r>
+            <w:r>
+              <w:rPr>
+                <w:rFonts w:ascii="Consolas" w:cs="Consolas" w:eastAsia="Consolas" w:hAnsi="Consolas"/>
+                <w:color w:val="1B3A2B"/>
+                <w:sz w:val="18"/>
+                <w:szCs w:val="18"/>
+              </w:rPr>
+              <w:t xml:space="preserve">ConflictException … Policy with the same name already exists</w:t>
+            </w:r>
+            <w:r>
+              <w:t xml:space="preserve"> on the shared names — and because the agent-specific permit is created first, this can leave a partial spine that must be torn down. Deploy and validate one agent at a time (run </w:t>
+            </w:r>
+            <w:r>
+              <w:rPr>
+                <w:rFonts w:ascii="Consolas" w:cs="Consolas" w:eastAsia="Consolas" w:hAnsi="Consolas"/>
+                <w:color w:val="1B3A2B"/>
+                <w:sz w:val="18"/>
+                <w:szCs w:val="18"/>
+              </w:rPr>
+              <w:t xml:space="preserve">destroy.sh</w:t>
+            </w:r>
+            <w:r>
+              <w:t xml:space="preserve"> for the live agent before deploying the next), or prefix the policy names per agent so multiple agents can coexist.</w:t>
+            </w:r>
+          </w:p>
+        </w:tc>
+      </w:tr>
+    </w:tbl>
     <w:p>
       <w:pPr>
         <w:pStyle w:val="Heading1"/>
@@ -4144,34 +4257,22 @@
           <w:b/>
           <w:bCs/>
         </w:rPr>
-        <w:t xml:space="preserve">Long, unattended runs: </w:t>
-      </w:r>
-      <w:r>
-        <w:t xml:space="preserve">run the 3–4 minute deploy, the venv build, and the CodeBuild launch detached, then poll a log — a foreground shell can be killed before they finish. The pattern that works: </w:t>
-      </w:r>
-      <w:r>
-        <w:rPr>
-          <w:rFonts w:ascii="Consolas" w:cs="Consolas" w:eastAsia="Consolas" w:hAnsi="Consolas"/>
-          <w:color w:val="1B3A2B"/>
-          <w:sz w:val="18"/>
-          <w:szCs w:val="18"/>
-        </w:rPr>
-        <w:t xml:space="preserve">Start-Process cmd.exe -ArgumentList '/c','"…\bash.exe" -l runner.sh &gt; x.log 2&gt;&amp;1' -WorkingDirectory &lt;no-space dir&gt; -WindowStyle Hidden</w:t>
-      </w:r>
-      <w:r>
-        <w:t xml:space="preserve">, where </w:t>
-      </w:r>
-      <w:r>
-        <w:rPr>
-          <w:rFonts w:ascii="Consolas" w:cs="Consolas" w:eastAsia="Consolas" w:hAnsi="Consolas"/>
-          <w:color w:val="1B3A2B"/>
-          <w:sz w:val="18"/>
-          <w:szCs w:val="18"/>
-        </w:rPr>
-        <w:t xml:space="preserve">runner.sh</w:t>
-      </w:r>
-      <w:r>
-        <w:t xml:space="preserve"> does </w:t>
+        <w:t xml:space="preserve">Detached long runs — Start-Process with a single-argument runner. </w:t>
+      </w:r>
+      <w:r>
+        <w:t xml:space="preserve">Run the 3–4 minute deploy, the venv build, and the CodeBuild launch detached, or a foreground shell can be killed before they finish. The pattern that works: write a runner script that self-logs and cds to the no-space dir (first lines </w:t>
+      </w:r>
+      <w:r>
+        <w:rPr>
+          <w:rFonts w:ascii="Consolas" w:cs="Consolas" w:eastAsia="Consolas" w:hAnsi="Consolas"/>
+          <w:color w:val="1B3A2B"/>
+          <w:sz w:val="18"/>
+          <w:szCs w:val="18"/>
+        </w:rPr>
+        <w:t xml:space="preserve">exec &gt; run.log 2&gt;&amp;1</w:t>
+      </w:r>
+      <w:r>
+        <w:t xml:space="preserve"> then </w:t>
       </w:r>
       <w:r>
         <w:rPr>
@@ -4183,43 +4284,63 @@
         <w:t xml:space="preserve">cd &lt;no-space dir&gt;</w:t>
       </w:r>
       <w:r>
-        <w:t xml:space="preserve"> then the command. Then </w:t>
-      </w:r>
-      <w:r>
-        <w:rPr>
-          <w:rFonts w:ascii="Consolas" w:cs="Consolas" w:eastAsia="Consolas" w:hAnsi="Consolas"/>
-          <w:color w:val="1B3A2B"/>
-          <w:sz w:val="18"/>
-          <w:szCs w:val="18"/>
-        </w:rPr>
-        <w:t xml:space="preserve">Get-Content x.log -Tail 20</w:t>
-      </w:r>
-      <w:r>
-        <w:t xml:space="preserve"> to watch progress. (</w:t>
-      </w:r>
-      <w:r>
-        <w:rPr>
-          <w:rFonts w:ascii="Consolas" w:cs="Consolas" w:eastAsia="Consolas" w:hAnsi="Consolas"/>
-          <w:color w:val="1B3A2B"/>
-          <w:sz w:val="18"/>
-          <w:szCs w:val="18"/>
-        </w:rPr>
-        <w:t xml:space="preserve">Start-Process bash.exe</w:t>
-      </w:r>
-      <w:r>
-        <w:t xml:space="preserve"> directly does not launch reliably; wrap it in </w:t>
-      </w:r>
-      <w:r>
-        <w:rPr>
-          <w:rFonts w:ascii="Consolas" w:cs="Consolas" w:eastAsia="Consolas" w:hAnsi="Consolas"/>
-          <w:color w:val="1B3A2B"/>
-          <w:sz w:val="18"/>
-          <w:szCs w:val="18"/>
-        </w:rPr>
-        <w:t xml:space="preserve">cmd.exe /c</w:t>
-      </w:r>
-      <w:r>
-        <w:t xml:space="preserve">.)</w:t>
+        <w:t xml:space="preserve"> then the command) and launch it with </w:t>
+      </w:r>
+      <w:r>
+        <w:rPr>
+          <w:rFonts w:ascii="Consolas" w:cs="Consolas" w:eastAsia="Consolas" w:hAnsi="Consolas"/>
+          <w:color w:val="1B3A2B"/>
+          <w:sz w:val="18"/>
+          <w:szCs w:val="18"/>
+        </w:rPr>
+        <w:t xml:space="preserve">Start-Process -FilePath 'C:\Program Files\Git\bin\bash.exe' -ArgumentList '/c/…/runner.sh' -WindowStyle Hidden</w:t>
+      </w:r>
+      <w:r>
+        <w:t xml:space="preserve">. Pass the runner path as </w:t>
+      </w:r>
+      <w:r>
+        <w:rPr>
+          <w:b/>
+          <w:bCs/>
+        </w:rPr>
+        <w:t xml:space="preserve">one space-free argument</w:t>
+      </w:r>
+      <w:r>
+        <w:t xml:space="preserve"> — PowerShell's </w:t>
+      </w:r>
+      <w:r>
+        <w:rPr>
+          <w:rFonts w:ascii="Consolas" w:cs="Consolas" w:eastAsia="Consolas" w:hAnsi="Consolas"/>
+          <w:color w:val="1B3A2B"/>
+          <w:sz w:val="18"/>
+          <w:szCs w:val="18"/>
+        </w:rPr>
+        <w:t xml:space="preserve">-ArgumentList</w:t>
+      </w:r>
+      <w:r>
+        <w:t xml:space="preserve"> joins a multi-token array unquoted, so </w:t>
+      </w:r>
+      <w:r>
+        <w:rPr>
+          <w:rFonts w:ascii="Consolas" w:cs="Consolas" w:eastAsia="Consolas" w:hAnsi="Consolas"/>
+          <w:color w:val="1B3A2B"/>
+          <w:sz w:val="18"/>
+          <w:szCs w:val="18"/>
+        </w:rPr>
+        <w:t xml:space="preserve">'-lc','bash /c/…/runner.sh'</w:t>
+      </w:r>
+      <w:r>
+        <w:t xml:space="preserve"> splits at the space and the process exits doing nothing. Verify progress by </w:t>
+      </w:r>
+      <w:r>
+        <w:rPr>
+          <w:b/>
+          <w:bCs/>
+        </w:rPr>
+        <w:t xml:space="preserve">polling AWS state</w:t>
+      </w:r>
+      <w:r>
+        <w:t xml:space="preserve"> (list the gateway / lambdas / policies); the runner log is block-buffered, so an empty log does not mean no progress.</w:t>
       </w:r>
     </w:p>
     <w:p>

</xml_diff>

<commit_message>
docs: SA runbook covers hash-chained audit + IdP federation (v1.2)
Regenerated the SA runbook (and synced its generator) to cover the two newest
high-value items: the tamper-evident hash-chained audit (Step 2 proof note, a
validation-checklist bullet for verify_chain.py, and the WORM row now flagged
hash-chained) and a new Step 6 for federating a corporate IdP (Okta / Entra)
via deploy_federation.sh, plus a project-layout pointer. Version bumped to 1.2.

Co-Authored-By: Claude Opus 4.8 <noreply@anthropic.com>
Claude-Session: https://claude.ai/code/session_01JRm57EwRbAnzJa2JnQaZ5j
</commit_message>
<xml_diff>
--- a/docs/Financial-Aid-AgentCore-SA-Runbook.docx
+++ b/docs/Financial-Aid-AgentCore-SA-Runbook.docx
@@ -65,7 +65,7 @@
           <w:sz w:val="19"/>
           <w:szCs w:val="19"/>
         </w:rPr>
-        <w:t xml:space="preserve">Step-by-step deployment of the governed Title IV financial-aid accelerator into an AWS account — identity, governance spine, tools, and the Runtime agent — from one manifest. Region: us-east-1. Every command in this runbook was run end to end to stand the agent up and prove 31/31 in ENFORCE. Accelerator reference; not production-certified. Version 1.1 · 2026.</w:t>
+        <w:t xml:space="preserve">Step-by-step deployment of the governed Title IV financial-aid accelerator into an AWS account — identity, governance spine, tools, and the Runtime agent — from one manifest. Region: us-east-1. Every command in this runbook was run end to end to stand the agent up and prove 31/31 in ENFORCE. Accelerator reference; not production-certified. Version 1.2 · 2026.</w:t>
       </w:r>
     </w:p>
     <w:p>
@@ -1173,6 +1173,59 @@
       </w:r>
       <w:r>
         <w:t xml:space="preserve">, and a mock OAuth-protected system of record. Deployed separately from the spine.</w:t>
+      </w:r>
+    </w:p>
+    <w:p>
+      <w:pPr>
+        <w:pStyle w:val="ListParagraph"/>
+        <w:numPr>
+          <w:ilvl w:val="0"/>
+          <w:numId w:val="1"/>
+        </w:numPr>
+        <w:spacing w:after="70" w:line="260"/>
+      </w:pPr>
+      <w:r>
+        <w:rPr>
+          <w:b/>
+          <w:bCs/>
+        </w:rPr>
+        <w:t xml:space="preserve">Corporate SSO (optional). </w:t>
+      </w:r>
+      <w:r>
+        <w:rPr>
+          <w:rFonts w:ascii="Consolas" w:cs="Consolas" w:eastAsia="Consolas" w:hAnsi="Consolas"/>
+          <w:color w:val="1B3A2B"/>
+          <w:sz w:val="18"/>
+          <w:szCs w:val="18"/>
+        </w:rPr>
+        <w:t xml:space="preserve">lib/engine/deploy_federation.sh</w:t>
+      </w:r>
+      <w:r>
+        <w:t xml:space="preserve"> + </w:t>
+      </w:r>
+      <w:r>
+        <w:rPr>
+          <w:rFonts w:ascii="Consolas" w:cs="Consolas" w:eastAsia="Consolas" w:hAnsi="Consolas"/>
+          <w:color w:val="1B3A2B"/>
+          <w:sz w:val="18"/>
+          <w:szCs w:val="18"/>
+        </w:rPr>
+        <w:t xml:space="preserve">lib/controls/idp_group_mapper.py</w:t>
+      </w:r>
+      <w:r>
+        <w:t xml:space="preserve"> federate an external OIDC/SAML IdP (Okta / Entra) into the pool so employees sign in with SSO and hit the SAME Cedar policies as the built-in users — see </w:t>
+      </w:r>
+      <w:r>
+        <w:rPr>
+          <w:rFonts w:ascii="Consolas" w:cs="Consolas" w:eastAsia="Consolas" w:hAnsi="Consolas"/>
+          <w:color w:val="1B3A2B"/>
+          <w:sz w:val="18"/>
+          <w:szCs w:val="18"/>
+        </w:rPr>
+        <w:t xml:space="preserve">docs/IdP-Federation-Reference.md</w:t>
+      </w:r>
+      <w:r>
+        <w:t xml:space="preserve">.</w:t>
       </w:r>
     </w:p>
     <w:p>
@@ -1713,7 +1766,7 @@
                 <w:sz w:val="19"/>
                 <w:szCs w:val="19"/>
               </w:rPr>
-              <w:t xml:space="preserve">DynamoDB fa-audit (append-only) + S3 Object Lock bucket fa-audit-worm-&lt;acct&gt;-&lt;region&gt;</w:t>
+              <w:t xml:space="preserve">DynamoDB fa-audit (append-only) + S3 Object Lock bucket fa-audit-worm-&lt;acct&gt;-&lt;region&gt;; each record hash-chained (tamper-evident)</w:t>
             </w:r>
           </w:p>
         </w:tc>
@@ -2451,6 +2504,52 @@
       </w:r>
     </w:p>
     <w:p>
+      <w:r>
+        <w:rPr>
+          <w:b/>
+          <w:bCs/>
+        </w:rPr>
+        <w:t xml:space="preserve">Tamper-evident audit. </w:t>
+      </w:r>
+      <w:r>
+        <w:t xml:space="preserve">The demo also proves the audit ledger is </w:t>
+      </w:r>
+      <w:r>
+        <w:rPr>
+          <w:b/>
+          <w:bCs/>
+        </w:rPr>
+        <w:t xml:space="preserve">hash-chained</w:t>
+      </w:r>
+      <w:r>
+        <w:t xml:space="preserve">: each record embeds the prior record’s hash (</w:t>
+      </w:r>
+      <w:r>
+        <w:rPr>
+          <w:rFonts w:ascii="Consolas" w:cs="Consolas" w:eastAsia="Consolas" w:hAnsi="Consolas"/>
+          <w:color w:val="1B3A2B"/>
+          <w:sz w:val="18"/>
+          <w:szCs w:val="18"/>
+        </w:rPr>
+        <w:t xml:space="preserve">chain_hash = SHA-256(prev_hash + entry_hash)</w:t>
+      </w:r>
+      <w:r>
+        <w:t xml:space="preserve">), so editing, reordering, or deleting any record breaks every link after it — on top of the append-only + Object-Lock guarantees. </w:t>
+      </w:r>
+      <w:r>
+        <w:rPr>
+          <w:rFonts w:ascii="Consolas" w:cs="Consolas" w:eastAsia="Consolas" w:hAnsi="Consolas"/>
+          <w:color w:val="1B3A2B"/>
+          <w:sz w:val="18"/>
+          <w:szCs w:val="18"/>
+        </w:rPr>
+        <w:t xml:space="preserve">lib/controls/verify_chain.py</w:t>
+      </w:r>
+      <w:r>
+        <w:t xml:space="preserve"> replays the links and reports INTACT or the first broken record.</w:t>
+      </w:r>
+    </w:p>
+    <w:p>
       <w:pPr>
         <w:pStyle w:val="Heading2"/>
       </w:pPr>
@@ -2912,6 +3011,200 @@
           <w:szCs w:val="17"/>
         </w:rPr>
         <w:t xml:space="preserve">bash lib/connector/prove_connector.sh  agents/financial-aid   # OAuth + RS256/JWKS + no stored secret + deny-by-default</w:t>
+      </w:r>
+    </w:p>
+    <w:p>
+      <w:pPr>
+        <w:pStyle w:val="Heading2"/>
+      </w:pPr>
+      <w:r>
+        <w:t xml:space="preserve">Step 6 (optional) — Federate your corporate IdP (SSO)</w:t>
+      </w:r>
+    </w:p>
+    <w:p>
+      <w:r>
+        <w:t xml:space="preserve">Swap the built-in test users for real employees from Okta / Microsoft Entra / any OIDC or SAML IdP, WITHOUT changing a Cedar policy. A Cognito Pre-Token-Generation Lambda (</w:t>
+      </w:r>
+      <w:r>
+        <w:rPr>
+          <w:rFonts w:ascii="Consolas" w:cs="Consolas" w:eastAsia="Consolas" w:hAnsi="Consolas"/>
+          <w:color w:val="1B3A2B"/>
+          <w:sz w:val="18"/>
+          <w:szCs w:val="18"/>
+        </w:rPr>
+        <w:t xml:space="preserve">idp_group_mapper.py</w:t>
+      </w:r>
+      <w:r>
+        <w:t xml:space="preserve">) maps the IdP’s group claim into </w:t>
+      </w:r>
+      <w:r>
+        <w:rPr>
+          <w:rFonts w:ascii="Consolas" w:cs="Consolas" w:eastAsia="Consolas" w:hAnsi="Consolas"/>
+          <w:color w:val="1B3A2B"/>
+          <w:sz w:val="18"/>
+          <w:szCs w:val="18"/>
+        </w:rPr>
+        <w:t xml:space="preserve">cognito:groups</w:t>
+      </w:r>
+      <w:r>
+        <w:t xml:space="preserve">, so the existing </w:t>
+      </w:r>
+      <w:r>
+        <w:rPr>
+          <w:rFonts w:ascii="Consolas" w:cs="Consolas" w:eastAsia="Consolas" w:hAnsi="Consolas"/>
+          <w:color w:val="1B3A2B"/>
+          <w:sz w:val="18"/>
+          <w:szCs w:val="18"/>
+        </w:rPr>
+        <w:t xml:space="preserve">aid_officer_permit</w:t>
+      </w:r>
+      <w:r>
+        <w:t xml:space="preserve"> authorizes federated users; a user whose groups map to nothing gets no role, so deny-by-default still holds. Idempotent and independent of the spine.</w:t>
+      </w:r>
+    </w:p>
+    <w:p>
+      <w:pPr>
+        <w:pStyle w:val="Code"/>
+        <w:pBdr>
+          <w:top w:val="single" w:color="DDE6DE" w:sz="4" w:space="3"/>
+          <w:left w:val="single" w:color="0B8F72" w:sz="18" w:space="6"/>
+        </w:pBdr>
+        <w:shd w:fill="F0F4F1" w:val="clear"/>
+        <w:spacing w:after="0" w:before="40" w:line="240"/>
+      </w:pPr>
+      <w:r>
+        <w:rPr>
+          <w:rFonts w:ascii="Consolas" w:cs="Consolas" w:eastAsia="Consolas" w:hAnsi="Consolas"/>
+          <w:sz w:val="17"/>
+          <w:szCs w:val="17"/>
+        </w:rPr>
+        <w:t xml:space="preserve"># OIDC (Okta / Entra / Ping …):</w:t>
+      </w:r>
+    </w:p>
+    <w:p>
+      <w:pPr>
+        <w:pStyle w:val="Code"/>
+        <w:pBdr>
+          <w:left w:val="single" w:color="0B8F72" w:sz="18" w:space="6"/>
+        </w:pBdr>
+        <w:shd w:fill="F0F4F1" w:val="clear"/>
+        <w:spacing w:after="0" w:before="0" w:line="240"/>
+      </w:pPr>
+      <w:r>
+        <w:rPr>
+          <w:rFonts w:ascii="Consolas" w:cs="Consolas" w:eastAsia="Consolas" w:hAnsi="Consolas"/>
+          <w:sz w:val="17"/>
+          <w:szCs w:val="17"/>
+        </w:rPr>
+        <w:t xml:space="preserve">IDP_TYPE=oidc IDP_NAME=Okta OIDC_ISSUER=https://&lt;org&gt;.okta.com \</w:t>
+      </w:r>
+    </w:p>
+    <w:p>
+      <w:pPr>
+        <w:pStyle w:val="Code"/>
+        <w:pBdr>
+          <w:left w:val="single" w:color="0B8F72" w:sz="18" w:space="6"/>
+        </w:pBdr>
+        <w:shd w:fill="F0F4F1" w:val="clear"/>
+        <w:spacing w:after="0" w:before="0" w:line="240"/>
+      </w:pPr>
+      <w:r>
+        <w:rPr>
+          <w:rFonts w:ascii="Consolas" w:cs="Consolas" w:eastAsia="Consolas" w:hAnsi="Consolas"/>
+          <w:sz w:val="17"/>
+          <w:szCs w:val="17"/>
+        </w:rPr>
+        <w:t xml:space="preserve">  OIDC_CLIENT_ID=&lt;id&gt; OIDC_CLIENT_SECRET=&lt;secret&gt; GROUPS_CLAIM=groups \</w:t>
+      </w:r>
+    </w:p>
+    <w:p>
+      <w:pPr>
+        <w:pStyle w:val="Code"/>
+        <w:pBdr>
+          <w:left w:val="single" w:color="0B8F72" w:sz="18" w:space="6"/>
+        </w:pBdr>
+        <w:shd w:fill="F0F4F1" w:val="clear"/>
+        <w:spacing w:after="0" w:before="0" w:line="240"/>
+      </w:pPr>
+      <w:r>
+        <w:rPr>
+          <w:rFonts w:ascii="Consolas" w:cs="Consolas" w:eastAsia="Consolas" w:hAnsi="Consolas"/>
+          <w:sz w:val="17"/>
+          <w:szCs w:val="17"/>
+        </w:rPr>
+        <w:t xml:space="preserve">  GROUP_MAP='{"FinancialAidOfficers":"aid_officer"}' \</w:t>
+      </w:r>
+    </w:p>
+    <w:p>
+      <w:pPr>
+        <w:pStyle w:val="Code"/>
+        <w:pBdr>
+          <w:left w:val="single" w:color="0B8F72" w:sz="18" w:space="6"/>
+        </w:pBdr>
+        <w:shd w:fill="F0F4F1" w:val="clear"/>
+        <w:spacing w:after="0" w:before="0" w:line="240"/>
+      </w:pPr>
+      <w:r>
+        <w:rPr>
+          <w:rFonts w:ascii="Consolas" w:cs="Consolas" w:eastAsia="Consolas" w:hAnsi="Consolas"/>
+          <w:sz w:val="17"/>
+          <w:szCs w:val="17"/>
+        </w:rPr>
+        <w:t xml:space="preserve">  bash lib/engine/deploy_federation.sh agents/financial-aid</w:t>
+      </w:r>
+    </w:p>
+    <w:p>
+      <w:pPr>
+        <w:pStyle w:val="Code"/>
+        <w:pBdr>
+          <w:left w:val="single" w:color="0B8F72" w:sz="18" w:space="6"/>
+        </w:pBdr>
+        <w:shd w:fill="F0F4F1" w:val="clear"/>
+        <w:spacing w:after="0" w:before="0" w:line="240"/>
+      </w:pPr>
+      <w:r>
+        <w:rPr>
+          <w:rFonts w:ascii="Consolas" w:cs="Consolas" w:eastAsia="Consolas" w:hAnsi="Consolas"/>
+          <w:sz w:val="17"/>
+          <w:szCs w:val="17"/>
+        </w:rPr>
+        <w:t xml:space="preserve"># tear the federation back down (keeps the base pool + test users):</w:t>
+      </w:r>
+    </w:p>
+    <w:p>
+      <w:pPr>
+        <w:pStyle w:val="Code"/>
+        <w:pBdr>
+          <w:bottom w:val="single" w:color="DDE6DE" w:sz="4" w:space="3"/>
+          <w:left w:val="single" w:color="0B8F72" w:sz="18" w:space="6"/>
+        </w:pBdr>
+        <w:shd w:fill="F0F4F1" w:val="clear"/>
+        <w:spacing w:after="140" w:before="0" w:line="240"/>
+      </w:pPr>
+      <w:r>
+        <w:rPr>
+          <w:rFonts w:ascii="Consolas" w:cs="Consolas" w:eastAsia="Consolas" w:hAnsi="Consolas"/>
+          <w:sz w:val="17"/>
+          <w:szCs w:val="17"/>
+        </w:rPr>
+        <w:t xml:space="preserve">DESTROY=1 IDP_NAME=Okta bash lib/engine/deploy_federation.sh agents/financial-aid</w:t>
+      </w:r>
+    </w:p>
+    <w:p>
+      <w:r>
+        <w:t xml:space="preserve">Full recipe (SAML too), the group→role mapping, and the adopter-owns boundary: </w:t>
+      </w:r>
+      <w:r>
+        <w:rPr>
+          <w:rFonts w:ascii="Consolas" w:cs="Consolas" w:eastAsia="Consolas" w:hAnsi="Consolas"/>
+          <w:color w:val="1B3A2B"/>
+          <w:sz w:val="18"/>
+          <w:szCs w:val="18"/>
+        </w:rPr>
+        <w:t xml:space="preserve">docs/IdP-Federation-Reference.md</w:t>
+      </w:r>
+      <w:r>
+        <w:t xml:space="preserve">.</w:t>
       </w:r>
     </w:p>
     <w:p>
@@ -3884,6 +4177,43 @@
       </w:r>
       <w:r>
         <w:t xml:space="preserve"> shows per-step, identity-tagged logs.</w:t>
+      </w:r>
+    </w:p>
+    <w:p>
+      <w:pPr>
+        <w:pStyle w:val="ListParagraph"/>
+        <w:numPr>
+          <w:ilvl w:val="0"/>
+          <w:numId w:val="1"/>
+        </w:numPr>
+        <w:spacing w:after="70" w:line="260"/>
+      </w:pPr>
+      <w:r>
+        <w:t xml:space="preserve">Tamper-evident audit: </w:t>
+      </w:r>
+      <w:r>
+        <w:rPr>
+          <w:rFonts w:ascii="Consolas" w:cs="Consolas" w:eastAsia="Consolas" w:hAnsi="Consolas"/>
+          <w:color w:val="1B3A2B"/>
+          <w:sz w:val="18"/>
+          <w:szCs w:val="18"/>
+        </w:rPr>
+        <w:t xml:space="preserve">lib/controls/verify_chain.py</w:t>
+      </w:r>
+      <w:r>
+        <w:t xml:space="preserve"> on a case’s records reports </w:t>
+      </w:r>
+      <w:r>
+        <w:rPr>
+          <w:rFonts w:ascii="Consolas" w:cs="Consolas" w:eastAsia="Consolas" w:hAnsi="Consolas"/>
+          <w:color w:val="1B3A2B"/>
+          <w:sz w:val="18"/>
+          <w:szCs w:val="18"/>
+        </w:rPr>
+        <w:t xml:space="preserve">intact: true</w:t>
+      </w:r>
+      <w:r>
+        <w:t xml:space="preserve">; altering any record makes it report the first broken link.</w:t>
       </w:r>
     </w:p>
     <w:p>

</xml_diff>